<commit_message>
Restore historical accuracy context and explain native save regression
</commit_message>
<xml_diff>
--- a/docs/downloads/project-x-review-ru.docx
+++ b/docs/downloads/project-x-review-ru.docx
@@ -17,7 +17,23 @@
     </w:p>
     <w:p>
       <w:r>
-        <w:t>Главный вывод: по имеющимся данным нельзя сказать, что наш инструмент значительно лучше. В первом проходе на одинаковых 17 страницах Project X с GLM получил 411 из 520 проверок данных, наш извлекатель — 399. После исправления известных ошибок оценивания у Project X 6 из 21 проверок чертежей, у нашего — 5. Это один проход; итог нашей связки с проверкой и исправлениями ещё не готов.</w:t>
+        <w:t>Наш прежний высокий результат сохранён: профиль 1.4.2 с MiniMax получил 483/500 (96,6%) в первом круге и 483/463/466 из 500 за три круга — среднее 94,13%. Это проверенная выборка табличных фактов, не точность всего текста и всех чертежей. Сводить этот результат только к слабому новому кругу было неверно.</w:t>
+      </w:r>
+    </w:p>
+    <w:p>
+      <w:r>
+        <w:t>В свежей расширенной серии первый проход нашего извлекателя получил 399/520, второй — 479/520; у Project X с GLM три круга дали 411/456/313. Итог нашей связки с проверкой и исправлениями ещё не готов. Новая слабая попытка не отменяет старые сохранённые результаты; ниже показаны одинаковый старый знаменатель, реальная ошибка сохранения и разброс.</w:t>
+      </w:r>
+    </w:p>
+    <w:p>
+      <w:pPr>
+        <w:spacing w:after="100"/>
+      </w:pPr>
+      <w:r>
+        <w:rPr>
+          <w:sz w:val="18"/>
+        </w:rPr>
+        <w:t>Наши прежние три круга: 96,6% в первом, среднее 94,13%: https://github.com/megamen32/catalog-extraction-benchmark/tree/main/examples/agent-routing/2026-10-12-repeated-runs</w:t>
       </w:r>
     </w:p>
     <w:p>
@@ -149,7 +165,7 @@
               <w:rPr>
                 <w:sz w:val="18"/>
               </w:rPr>
-              <w:t>1 круг показан</w:t>
+              <w:t>2 круга показаны; третий впереди</w:t>
             </w:r>
           </w:p>
         </w:tc>
@@ -162,7 +178,7 @@
               <w:rPr>
                 <w:sz w:val="18"/>
               </w:rPr>
-              <w:t>399</w:t>
+              <w:t>399; 479</w:t>
             </w:r>
           </w:p>
         </w:tc>
@@ -175,7 +191,7 @@
               <w:rPr>
                 <w:sz w:val="18"/>
               </w:rPr>
-              <w:t>5</w:t>
+              <w:t>5; 6</w:t>
             </w:r>
           </w:p>
         </w:tc>
@@ -188,7 +204,7 @@
               <w:rPr>
                 <w:sz w:val="18"/>
               </w:rPr>
-              <w:t>15/17</w:t>
+              <w:t>15/17; 16/17</w:t>
             </w:r>
           </w:p>
         </w:tc>
@@ -328,6 +344,32 @@
         </w:tc>
       </w:tr>
     </w:tbl>
+    <w:p>
+      <w:r>
+        <w:t>На одних и тех же прежних 500 проверках новые выходы отдельно переоценены установленным старым оценщиком 0.2.4: первый круг — 381/500 (76,2%), второй — 459/500 (91,8%). Современный оценщик даёт на этом поднаборе те же числа. Новых вызовов моделей и исправлений JSON для этого пересчёта не было.</w:t>
+      </w:r>
+    </w:p>
+    <w:p>
+      <w:r>
+        <w:t>Поэтому падение первого круга нельзя объяснить только добавлением страниц 27/39 или ужесточением проверки чертежей. На странице инноваций 38 подтверждён сбой инструмента: полный JSON с таблицей 12 столбцов × 6 строк и текстом был сохранён и получил 72/72 при отдельной диагностической проверке; затем правка рисунка и finalize_page затёрли таблицы и текстовые блоки. Это потеря 72 выбранных фактов в конечном файле. Ещё две попытки на старых страницах завершились без JSON и дали ноль, суммарно 30 фактов; остальные пропуски — 17. Это фактические ошибки доставки/извлечения, а не отмена прежних правильных файлов.</w:t>
+      </w:r>
+    </w:p>
+    <w:p>
+      <w:r>
+        <w:t>В отдельной составной версии инструментов сохранение таблиц после правки рисунка проверено без новых модельных вызовов. Эта версия ещё не получила три свежих полных круга и не наследует 94,13%. Замороженные текущие попытки, их неудачные JSON и оценки остаются неизменными.</w:t>
+      </w:r>
+    </w:p>
+    <w:p>
+      <w:pPr>
+        <w:spacing w:after="100"/>
+      </w:pPr>
+      <w:r>
+        <w:rPr>
+          <w:sz w:val="18"/>
+        </w:rPr>
+        <w:t>Пересчёт свежих выходов на прежних 500 проверках: https://github.com/megamen32/catalog-extraction-benchmark/blob/main/docs/downloads/our-accuracy-history.json</w:t>
+      </w:r>
+    </w:p>
     <w:p>
       <w:r>
         <w:t>Таблица использует отдельную исправленную оценку 0.3.2: она устраняет известные различия обозначений физических единиц и поддерживает некоторые английские описания геометрии. Исходные JSON и оценки 0.3.0/0.3.1 сохранены. Любая неудачная попытка остаётся нулём на полном знаменателе; не считаем только удачные страницы.</w:t>
@@ -1018,7 +1060,7 @@
     </w:p>
     <w:p>
       <w:r>
-        <w:t>Полностью заменять наше решение или отбрасывать Project X по нынешним данным рано. У Project X с GLM хорошие результаты извлечения на части сложных таблиц; после исправления оценивания его первый проход немного выше нашего. Большого проверенного преимущества нашего инструмента нет. Для чертежей обоим решениям нужны дополнительные проверки.</w:t>
+        <w:t>Полностью заменять наше решение или отбрасывать Project X по нынешним данным рано. У нашего профиля есть подтверждённая историческая серия со средним 94,13% на прежних 500 фактах. В новой серии Project X с GLM выше нашего в первом круге, наш извлекатель выше во втором. Общий устойчивый победитель свежего сравнения ещё не установлен. Для чертежей обоим решениям нужны дополнительные проверки.</w:t>
       </w:r>
     </w:p>
     <w:p>
@@ -1086,7 +1128,18 @@
     </w:p>
     <w:p>
       <w:r>
-        <w:t>Во втором круге нашей связки уже появился первый принятый случай. Это не меняет результат первого круга и ещё не является завершённой оценкой всех 17 страниц.</w:t>
+        <w:t>Во втором круге нашей связки все 17 первых попыток уже выполнены: пригодный JSON у 16, табличные проверки 479/520 (92,12%), чертежи 6/21. Принятые проверяющим страницы и дальнейшие исправления учитываются отдельно. Это не меняет первый круг и ещё не является итогом всех трёх кругов.</w:t>
+      </w:r>
+    </w:p>
+    <w:p>
+      <w:pPr>
+        <w:spacing w:after="100"/>
+      </w:pPr>
+      <w:r>
+        <w:rPr>
+          <w:sz w:val="18"/>
+        </w:rPr>
+        <w:t>Наш новый второй круг: исходные JSON и проверка публикации: https://github.com/megamen32/catalog-extraction-benchmark/tree/main/examples/agent-routing/2026-10-12-mixed-v2/first-pass-round-2</w:t>
       </w:r>
     </w:p>
     <w:p>

</xml_diff>